<commit_message>
vsc & n8n connection initiated [webhook]
</commit_message>
<xml_diff>
--- a/credit_memo_and_proposal/credit_memo_BrainStatic_Sp_z_oo.docx
+++ b/credit_memo_and_proposal/credit_memo_BrainStatic_Sp_z_oo.docx
@@ -23,7 +23,7 @@
         <w:rPr>
           <w:sz w:val="20"/>
         </w:rPr>
-        <w:t>BrainStatic Sp. z o.o.  |  APP-2024-00847  |  Prepared: 21 April 2026</w:t>
+        <w:t>BrainStatic Sp. z o.o.  |  APP-2024-00847  |  Prepared: 22 April 2026</w:t>
       </w:r>
     </w:p>
     <w:p>
@@ -817,7 +817,7 @@
               <w:rPr>
                 <w:sz w:val="20"/>
               </w:rPr>
-              <w:t>14.9%</w:t>
+              <w:t>14.7%</w:t>
             </w:r>
           </w:p>
         </w:tc>
@@ -871,7 +871,7 @@
         <w:rPr>
           <w:sz w:val="20"/>
         </w:rPr>
-        <w:t>BrainStatic has demonstrated a steady revenue growth trend, with revenues increasing from PLN 2,980,000 in 2021 to PLN 4,200,000 in 2023. The company's EBITDA has also shown an upward trend, reaching PLN 630,000 in 2023, resulting in a net profit of PLN 310,000. The company's leverage has remained relatively stable, with a total debt of PLN 1,100,000 and equity of PLN 1,540,000 in 2023.</w:t>
+        <w:t>BrainStatic has demonstrated a steady revenue growth trend, with revenues increasing from PLN 2,980,000 in 2021 to PLN 4,200,000 in 2023. The company's EBITDA has also shown a positive trend, with a margin of 15% in 2023. BrainStatic's profitability has improved over the years, with net profit increasing to PLN 310,000 in 2023. The company's leverage has remained relatively stable, with a debt-to-equity ratio of 0.71 in 2023.</w:t>
       </w:r>
     </w:p>
     <w:p>
@@ -976,7 +976,7 @@
         <w:rPr>
           <w:sz w:val="20"/>
         </w:rPr>
-        <w:t>Rapid expansion plans may strain cash flows</w:t>
+        <w:t>Potential fluctuations in the transportation and logistics industry</w:t>
       </w:r>
     </w:p>
     <w:p>
@@ -1080,7 +1080,7 @@
         <w:rPr>
           <w:sz w:val="20"/>
         </w:rPr>
-        <w:t>Based on the company's strong financial performance, steady revenue growth, and the CEO's industry reputation, the loan request is recommended for approval. The collateral offered provides a reasonable level of security, and the company's expansion plans are expected to drive business growth and increase revenue. However, close monitoring of the company's cash flows and debt levels will be necessary to ensure timely loan repayments.</w:t>
+        <w:t>Based on the company's strong financial performance, steady revenue growth trend, and the CEO's industry reputation, the loan request is recommended for approval. The collateral offered provides a reasonable level of security, and the company's credit score and payment history are satisfactory. However, close monitoring of the company's financial performance and debt servicing capabilities is recommended.</w:t>
       </w:r>
     </w:p>
     <w:p>
@@ -1104,7 +1104,7 @@
         <w:rPr>
           <w:sz w:val="20"/>
         </w:rPr>
-        <w:t>Regular financial reporting and monitoring of cash flows</w:t>
+        <w:t>Regular financial reporting and monitoring</w:t>
       </w:r>
     </w:p>
     <w:p>
@@ -1115,7 +1115,7 @@
         <w:rPr>
           <w:sz w:val="20"/>
         </w:rPr>
-        <w:t>Maintenance of a minimum debt-to-equity ratio of 0.8</w:t>
+        <w:t>Maintenance of a minimum debt-to-EBITDA ratio of 2.0</w:t>
       </w:r>
     </w:p>
     <w:p>
@@ -1126,7 +1126,7 @@
         <w:rPr>
           <w:sz w:val="20"/>
         </w:rPr>
-        <w:t>Personal guarantee of the majority shareholder to be enforced in case of default</w:t>
+        <w:t>Personal guarantee of the majority shareholder to be kept in place for the duration of the loan</w:t>
       </w:r>
     </w:p>
     <w:p>
@@ -1143,7 +1143,7 @@
           <w:color w:val="808080"/>
           <w:sz w:val="16"/>
         </w:rPr>
-        <w:t>This memorandum was prepared by Anna Wisniewska on 21 April 2026 using FinServe AI Credit Memo Generator. It is intended for internal use by the credit committee only.</w:t>
+        <w:t>This memorandum was prepared by Anna Wisniewska on 22 April 2026 using FinServe AI Credit Memo Generator. It is intended for internal use by the credit committee only.</w:t>
       </w:r>
     </w:p>
     <w:sectPr>

</xml_diff>